<commit_message>
Menyelesaikan konflik: mempertahankan file laporan lokal
</commit_message>
<xml_diff>
--- a/LAPORAN.docx
+++ b/LAPORAN.docx
@@ -944,16 +944,8 @@
         <w:rPr>
           <w:rFonts w:ascii="Times New Roman" w:hAnsi="Times New Roman" w:cs="Times New Roman"/>
         </w:rPr>
-        <w:t>s3-creator-hub</w:t>
-      </w:r>
-      <w:proofErr w:type="gramStart"/>
-      <w:r>
-        <w:rPr>
-          <w:rFonts w:ascii="Times New Roman" w:hAnsi="Times New Roman" w:cs="Times New Roman"/>
-        </w:rPr>
-        <w:t>/.env</w:t>
-      </w:r>
-      <w:proofErr w:type="gramEnd"/>
+        <w:t>s3-creator-hub/.env</w:t>
+      </w:r>
       <w:r>
         <w:rPr>
           <w:rFonts w:ascii="Times New Roman" w:hAnsi="Times New Roman" w:cs="Times New Roman"/>
@@ -1356,21 +1348,7 @@
         <w:rPr>
           <w:rFonts w:ascii="Times New Roman" w:hAnsi="Times New Roman" w:cs="Times New Roman"/>
         </w:rPr>
-        <w:t xml:space="preserve"> </w:t>
-      </w:r>
-      <w:proofErr w:type="gramStart"/>
-      <w:r>
-        <w:rPr>
-          <w:rFonts w:ascii="Times New Roman" w:hAnsi="Times New Roman" w:cs="Times New Roman"/>
-        </w:rPr>
-        <w:t>terminal :</w:t>
-      </w:r>
-      <w:proofErr w:type="gramEnd"/>
-      <w:r>
-        <w:rPr>
-          <w:rFonts w:ascii="Times New Roman" w:hAnsi="Times New Roman" w:cs="Times New Roman"/>
-        </w:rPr>
-        <w:t xml:space="preserve"> git clone </w:t>
+        <w:t xml:space="preserve"> terminal : git clone </w:t>
       </w:r>
       <w:hyperlink r:id="rId5" w:history="1">
         <w:r>
@@ -1417,7 +1395,6 @@
         <w:t xml:space="preserve"> di </w:t>
       </w:r>
       <w:proofErr w:type="spellStart"/>
-      <w:proofErr w:type="gramStart"/>
       <w:r>
         <w:rPr>
           <w:rFonts w:ascii="Times New Roman" w:hAnsi="Times New Roman" w:cs="Times New Roman"/>
@@ -1429,14 +1406,7 @@
         <w:rPr>
           <w:rFonts w:ascii="Times New Roman" w:hAnsi="Times New Roman" w:cs="Times New Roman"/>
         </w:rPr>
-        <w:t xml:space="preserve"> :</w:t>
-      </w:r>
-      <w:proofErr w:type="gramEnd"/>
-      <w:r>
-        <w:rPr>
-          <w:rFonts w:ascii="Times New Roman" w:hAnsi="Times New Roman" w:cs="Times New Roman"/>
-        </w:rPr>
-        <w:t xml:space="preserve"> python -m </w:t>
+        <w:t xml:space="preserve"> : python -m </w:t>
       </w:r>
       <w:proofErr w:type="spellStart"/>
       <w:r>
@@ -1512,7 +1482,6 @@
         <w:t xml:space="preserve"> di </w:t>
       </w:r>
       <w:proofErr w:type="spellStart"/>
-      <w:proofErr w:type="gramStart"/>
       <w:r>
         <w:rPr>
           <w:rFonts w:ascii="Times New Roman" w:hAnsi="Times New Roman" w:cs="Times New Roman"/>
@@ -1530,14 +1499,7 @@
         <w:rPr>
           <w:rFonts w:ascii="Times New Roman" w:hAnsi="Times New Roman" w:cs="Times New Roman"/>
         </w:rPr>
-        <w:t>:</w:t>
-      </w:r>
-      <w:proofErr w:type="gramEnd"/>
-      <w:r>
-        <w:rPr>
-          <w:rFonts w:ascii="Times New Roman" w:hAnsi="Times New Roman" w:cs="Times New Roman"/>
-        </w:rPr>
-        <w:t xml:space="preserve"> .\.</w:t>
+        <w:t>: .\.</w:t>
       </w:r>
       <w:proofErr w:type="spellStart"/>
       <w:r>
@@ -1824,21 +1786,7 @@
         <w:rPr>
           <w:rFonts w:ascii="Times New Roman" w:hAnsi="Times New Roman" w:cs="Times New Roman"/>
         </w:rPr>
-        <w:t xml:space="preserve"> file </w:t>
-      </w:r>
-      <w:proofErr w:type="gramStart"/>
-      <w:r>
-        <w:rPr>
-          <w:rFonts w:ascii="Times New Roman" w:hAnsi="Times New Roman" w:cs="Times New Roman"/>
-        </w:rPr>
-        <w:t>'.env</w:t>
-      </w:r>
-      <w:proofErr w:type="gramEnd"/>
-      <w:r>
-        <w:rPr>
-          <w:rFonts w:ascii="Times New Roman" w:hAnsi="Times New Roman" w:cs="Times New Roman"/>
-        </w:rPr>
-        <w:t xml:space="preserve">' di </w:t>
+        <w:t xml:space="preserve"> file '.env' di </w:t>
       </w:r>
       <w:proofErr w:type="spellStart"/>
       <w:r>
@@ -1923,6 +1871,18 @@
           <w:rFonts w:ascii="Times New Roman" w:hAnsi="Times New Roman" w:cs="Times New Roman"/>
         </w:rPr>
         <w:t>:</w:t>
+      </w:r>
+      <w:r>
+        <w:rPr>
+          <w:rFonts w:ascii="Times New Roman" w:hAnsi="Times New Roman" w:cs="Times New Roman"/>
+        </w:rPr>
+        <w:t>(BUAT JIKA TIDAK A</w:t>
+      </w:r>
+      <w:r>
+        <w:rPr>
+          <w:rFonts w:ascii="Times New Roman" w:hAnsi="Times New Roman" w:cs="Times New Roman"/>
+        </w:rPr>
+        <w:t>DA)</w:t>
       </w:r>
     </w:p>
     <w:p>
@@ -2704,8 +2664,52 @@
           <w:rFonts w:ascii="Times New Roman" w:hAnsi="Times New Roman" w:cs="Times New Roman"/>
           <w:lang w:val="fi-FI"/>
         </w:rPr>
+        <w:t>Buka Docker Desktop nya</w:t>
+      </w:r>
+    </w:p>
+    <w:p>
+      <w:pPr>
+        <w:spacing w:after="0" w:line="360" w:lineRule="auto"/>
+        <w:jc w:val="both"/>
+        <w:rPr>
+          <w:rFonts w:ascii="Times New Roman" w:hAnsi="Times New Roman" w:cs="Times New Roman"/>
+          <w:lang w:val="fi-FI"/>
+        </w:rPr>
+      </w:pPr>
+      <w:r>
+        <w:rPr>
+          <w:rFonts w:ascii="Times New Roman" w:hAnsi="Times New Roman" w:cs="Times New Roman"/>
+          <w:lang w:val="fi-FI"/>
+        </w:rPr>
+        <w:t>Aktifkan stackport localhost:8080</w:t>
+      </w:r>
+    </w:p>
+    <w:p>
+      <w:pPr>
+        <w:spacing w:after="0" w:line="360" w:lineRule="auto"/>
+        <w:jc w:val="both"/>
+        <w:rPr>
+          <w:rFonts w:ascii="Times New Roman" w:hAnsi="Times New Roman" w:cs="Times New Roman"/>
+          <w:lang w:val="fi-FI"/>
+        </w:rPr>
+      </w:pPr>
+      <w:r>
+        <w:rPr>
+          <w:rFonts w:ascii="Times New Roman" w:hAnsi="Times New Roman" w:cs="Times New Roman"/>
+          <w:lang w:val="fi-FI"/>
+        </w:rPr>
         <w:t>Buka web browser anda</w:t>
       </w:r>
+    </w:p>
+    <w:p>
+      <w:pPr>
+        <w:spacing w:after="0" w:line="360" w:lineRule="auto"/>
+        <w:jc w:val="both"/>
+        <w:rPr>
+          <w:rFonts w:ascii="Times New Roman" w:hAnsi="Times New Roman" w:cs="Times New Roman"/>
+          <w:lang w:val="fi-FI"/>
+        </w:rPr>
+      </w:pPr>
     </w:p>
     <w:p>
       <w:pPr>
@@ -2994,6 +2998,7 @@
         <w:rPr>
           <w:rFonts w:ascii="Times New Roman" w:hAnsi="Times New Roman" w:cs="Times New Roman"/>
         </w:rPr>
+        <w:lastRenderedPageBreak/>
         <w:t>Region: us-east-1</w:t>
       </w:r>
     </w:p>
@@ -3053,7 +3058,6 @@
         <w:rPr>
           <w:rFonts w:ascii="Times New Roman" w:hAnsi="Times New Roman" w:cs="Times New Roman"/>
         </w:rPr>
-        <w:lastRenderedPageBreak/>
         <w:t>Secret Access Key: test</w:t>
       </w:r>
     </w:p>
@@ -3172,6 +3176,141 @@
           <w:rFonts w:ascii="Times New Roman" w:hAnsi="Times New Roman" w:cs="Times New Roman"/>
         </w:rPr>
       </w:pPr>
+    </w:p>
+    <w:p>
+      <w:pPr>
+        <w:spacing w:after="0" w:line="360" w:lineRule="auto"/>
+        <w:jc w:val="both"/>
+        <w:rPr>
+          <w:rFonts w:ascii="Times New Roman" w:hAnsi="Times New Roman" w:cs="Times New Roman"/>
+        </w:rPr>
+      </w:pPr>
+      <w:r>
+        <w:rPr>
+          <w:rFonts w:ascii="Times New Roman" w:hAnsi="Times New Roman" w:cs="Times New Roman"/>
+        </w:rPr>
+        <w:t xml:space="preserve">Ganti </w:t>
+      </w:r>
+      <w:proofErr w:type="spellStart"/>
+      <w:r>
+        <w:rPr>
+          <w:rFonts w:ascii="Times New Roman" w:hAnsi="Times New Roman" w:cs="Times New Roman"/>
+        </w:rPr>
+        <w:t>penggunaan</w:t>
+      </w:r>
+      <w:proofErr w:type="spellEnd"/>
+      <w:r>
+        <w:rPr>
+          <w:rFonts w:ascii="Times New Roman" w:hAnsi="Times New Roman" w:cs="Times New Roman"/>
+        </w:rPr>
+        <w:t xml:space="preserve"> endpoint yang </w:t>
+      </w:r>
+      <w:proofErr w:type="spellStart"/>
+      <w:r>
+        <w:rPr>
+          <w:rFonts w:ascii="Times New Roman" w:hAnsi="Times New Roman" w:cs="Times New Roman"/>
+        </w:rPr>
+        <w:t>sudah</w:t>
+      </w:r>
+      <w:proofErr w:type="spellEnd"/>
+      <w:r>
+        <w:rPr>
+          <w:rFonts w:ascii="Times New Roman" w:hAnsi="Times New Roman" w:cs="Times New Roman"/>
+        </w:rPr>
+        <w:t xml:space="preserve"> </w:t>
+      </w:r>
+      <w:proofErr w:type="spellStart"/>
+      <w:r>
+        <w:rPr>
+          <w:rFonts w:ascii="Times New Roman" w:hAnsi="Times New Roman" w:cs="Times New Roman"/>
+        </w:rPr>
+        <w:t>dibuat</w:t>
+      </w:r>
+      <w:proofErr w:type="spellEnd"/>
+      <w:r>
+        <w:rPr>
+          <w:rFonts w:ascii="Times New Roman" w:hAnsi="Times New Roman" w:cs="Times New Roman"/>
+        </w:rPr>
+        <w:t xml:space="preserve">, </w:t>
+      </w:r>
+      <w:proofErr w:type="spellStart"/>
+      <w:r>
+        <w:rPr>
+          <w:rFonts w:ascii="Times New Roman" w:hAnsi="Times New Roman" w:cs="Times New Roman"/>
+        </w:rPr>
+        <w:t>disebelah</w:t>
+      </w:r>
+      <w:proofErr w:type="spellEnd"/>
+      <w:r>
+        <w:rPr>
+          <w:rFonts w:ascii="Times New Roman" w:hAnsi="Times New Roman" w:cs="Times New Roman"/>
+        </w:rPr>
+        <w:t xml:space="preserve"> </w:t>
+      </w:r>
+      <w:proofErr w:type="spellStart"/>
+      <w:r>
+        <w:rPr>
+          <w:rFonts w:ascii="Times New Roman" w:hAnsi="Times New Roman" w:cs="Times New Roman"/>
+        </w:rPr>
+        <w:t>kiri</w:t>
+      </w:r>
+      <w:proofErr w:type="spellEnd"/>
+      <w:r>
+        <w:rPr>
+          <w:rFonts w:ascii="Times New Roman" w:hAnsi="Times New Roman" w:cs="Times New Roman"/>
+        </w:rPr>
+        <w:t xml:space="preserve"> </w:t>
+      </w:r>
+      <w:proofErr w:type="spellStart"/>
+      <w:r>
+        <w:rPr>
+          <w:rFonts w:ascii="Times New Roman" w:hAnsi="Times New Roman" w:cs="Times New Roman"/>
+        </w:rPr>
+        <w:t>bawah</w:t>
+      </w:r>
+      <w:proofErr w:type="spellEnd"/>
+      <w:r>
+        <w:rPr>
+          <w:rFonts w:ascii="Times New Roman" w:hAnsi="Times New Roman" w:cs="Times New Roman"/>
+        </w:rPr>
+        <w:t xml:space="preserve">, </w:t>
+      </w:r>
+      <w:proofErr w:type="spellStart"/>
+      <w:r>
+        <w:rPr>
+          <w:rFonts w:ascii="Times New Roman" w:hAnsi="Times New Roman" w:cs="Times New Roman"/>
+        </w:rPr>
+        <w:t>dari</w:t>
+      </w:r>
+      <w:proofErr w:type="spellEnd"/>
+      <w:r>
+        <w:rPr>
+          <w:rFonts w:ascii="Times New Roman" w:hAnsi="Times New Roman" w:cs="Times New Roman"/>
+        </w:rPr>
+        <w:t xml:space="preserve"> default </w:t>
+      </w:r>
+      <w:proofErr w:type="spellStart"/>
+      <w:r>
+        <w:rPr>
+          <w:rFonts w:ascii="Times New Roman" w:hAnsi="Times New Roman" w:cs="Times New Roman"/>
+        </w:rPr>
+        <w:t>menjadi</w:t>
+      </w:r>
+      <w:proofErr w:type="spellEnd"/>
+      <w:r>
+        <w:rPr>
+          <w:rFonts w:ascii="Times New Roman" w:hAnsi="Times New Roman" w:cs="Times New Roman"/>
+        </w:rPr>
+        <w:t xml:space="preserve"> </w:t>
+      </w:r>
+      <w:proofErr w:type="spellStart"/>
+      <w:r>
+        <w:rPr>
+          <w:rFonts w:ascii="Times New Roman" w:hAnsi="Times New Roman" w:cs="Times New Roman"/>
+        </w:rPr>
+        <w:t>localstack</w:t>
+      </w:r>
+      <w:proofErr w:type="spellEnd"/>
     </w:p>
     <w:p>
       <w:pPr>
@@ -3864,6 +4003,7 @@
   <w:style w:type="character" w:default="1" w:styleId="DefaultParagraphFont">
     <w:name w:val="Default Paragraph Font"/>
     <w:uiPriority w:val="1"/>
+    <w:semiHidden/>
     <w:unhideWhenUsed/>
   </w:style>
   <w:style w:type="table" w:default="1" w:styleId="TableNormal">

</xml_diff>